<commit_message>
Përditëso abstraktin, validimin, ndërfaqen dhe prezantimin
Abstrakti merr pranueshmërinë e rishkrimeve dhe mbetet nën 360 fjalë. Te
4.10 numrat e testeve të 8 tetorit (797 dhe 173), te 4.8 mënyra e thjeshtë
dhe te 4.11 imazhi Docker. Prezantimi merr krahasimin me PMD-në, sllajdin
«A ia vlejnë rishkrimet?» dhe saktëson verifikimin dhe kufizimet (VD-147).
</commit_message>
<xml_diff>
--- a/docs/thesis/Punim_Diplome_Florent_Latifi_Kapitujt_1-4.docx
+++ b/docs/thesis/Punim_Diplome_Florent_Latifi_Kapitujt_1-4.docx
@@ -600,7 +600,7 @@
           <w:caps w:val="0"/>
           <w:sz w:val="24"/>
         </w:rPr>
-        <w:t>Dy rezultate janë negative dhe raportohen si të tilla. Ashpërsia që sistemi e derivon nga teprica mbi pragje nuk e riprodhon gjykimin e rishikuesve: pajtimi i matur me kappa me peshë qëndron te 0.007 deri 0.293, dhe gabimi anon nga mbivlerësimi. Po ashtu, vetë rishikuesit pajtohen mes tyre me MCC 0.022 deri 0.238, çka tregon se një pjesë e pareduktueshme e gabimit të çdo detektori i takon përkufizimit të erës dhe jo detektorit. Motori i refaktorimit automatizon tri transformime dhe transformoi 22.4% të vendeve të detektuara; refuzimi trajtohet si rezultat i saktë dhe numërohet. Kontributi kryesor nuk është një shifër e vetme, por një zinxhir i plotë dhe i riprodhueshëm, nga korpusi deri te rezultati.</w:t>
+        <w:t>Dy rezultate janë negative dhe raportohen si të tilla. Ashpërsia që sistemi e derivon nga teprica mbi pragje nuk e riprodhon gjykimin e rishikuesve: pajtimi i matur me kappa me peshë qëndron te 0.007 deri 0.293, dhe gabimi anon nga mbivlerësimi. Po ashtu, vetë rishikuesit pajtohen mes tyre me MCC 0.022 deri 0.238, çka tregon se një pjesë e pareduktueshme e gabimit të çdo detektori i takon përkufizimit të erës dhe jo detektorit. Motori i refaktorimit automatizon tri transformime dhe transformoi 22.4% të vendeve të detektuara; refuzimi trajtohet si rezultat i saktë dhe numërohet. Leximi i 60 rishkrimeve tregon se 62.9% e tyre, të ripeshuara, janë të pranueshme për një zhvillues: Replace Nested Conditional with Guard Clauses gjithmonë, Introduce Parameter Object asnjëherë, sepse e heq erën nga matja dhe jo nga kodi. Kontributi kryesor nuk është një shifër e vetme, por një zinxhir i plotë dhe i riprodhueshëm, nga korpusi deri te rezultati.</w:t>
       </w:r>
     </w:p>
     <w:p>
@@ -5115,6 +5115,22 @@
     </w:p>
     <w:p>
       <w:pPr>
+        <w:spacing w:line="360" w:lineRule="auto"/>
+        <w:ind w:firstLine="360"/>
+        <w:jc w:val="both"/>
+      </w:pPr>
+      <w:r>
+        <w:rPr>
+          <w:rFonts w:ascii="Times New Roman" w:hAnsi="Times New Roman" w:eastAsia="Times New Roman"/>
+          <w:b w:val="0"/>
+          <w:caps w:val="0"/>
+          <w:sz w:val="24"/>
+        </w:rPr>
+        <w:t>Ndërfaqja ka dy mënyra leximi. Mënyra teknike përdor emrat e literaturës, si Feature Envy ose klauzola «WOC &lt; 0.333». Mënyra e thjeshtë, që hapet si parazgjedhje për një vizitor të ri, i jep çdo ere, metrike, ashpërsie dhe refaktorimi një emër shqip dhe një fjali që e shpjegon, dhe çdo klauzolë e lexon si fjali: «Rreshtat e kodit të metodës: 77 (problem kur është mbi 35)». Shpjegimet janë në një fjalor të vetëm, që e lexojnë njësoj ndërfaqja dhe rreshti i komandës me opsionin --thjeshte, dhe testet kontrollojnë që çdo term që prodhon sistemi të ketë shpjegim.</w:t>
+      </w:r>
+    </w:p>
+    <w:p>
+      <w:pPr>
         <w:pStyle w:val="Heading2"/>
       </w:pPr>
       <w:r>
@@ -5570,7 +5586,7 @@
           <w:caps w:val="0"/>
           <w:sz w:val="24"/>
         </w:rPr>
-        <w:t>Rregulli kryesor është që asnjë prag, metrikë apo detektor nuk ndryshohet vetëm që të kalojë një test; kur kodi dhe testi nuk pajtohen, gjendet më parë cili është i gabuar. Në verifikimin e fundit, më 25 shtator 2026, kaluan 717 teste të backend-it, me mbulim 96% të kodit, dhe 165 teste të ndërfaqes.</w:t>
+        <w:t>Rregulli kryesor është që asnjë prag, metrikë apo detektor nuk ndryshohet vetëm që të kalojë një test; kur kodi dhe testi nuk pajtohen, gjendet më parë cili është i gabuar. Në verifikimin e fundit, më 8 tetor 2026, kaluan 797 teste të backend-it, me mbulim 96% të kodit, dhe 173 teste të ndërfaqes.</w:t>
       </w:r>
     </w:p>
     <w:p>
@@ -5658,6 +5674,22 @@
           <w:sz w:val="24"/>
         </w:rPr>
         <w:t xml:space="preserve"> Eksperimentet u ekzekutuan në një laptop pa kartë grafike të dedikuar, me Windows 11, Python 3.13.1 dhe JDK 21. Çdo skedar rezultati mban commit-in e kodit që e prodhoi, platformën dhe versionin e Python-it, ndaj një shifër lidhet gjithmonë me kodin e saktë që e nxori. Trajnimi i modeleve zgjat disa minuta, ndërsa ekzekutimi i motorit të refaktorimit mbi tërë korpusin disa orë, sepse javac thirret dy herë për çdo skedar të rishkruar. Asnjë hap nuk kërkon shërbim në re apo me pagesë.</w:t>
+      </w:r>
+    </w:p>
+    <w:p>
+      <w:pPr>
+        <w:spacing w:line="360" w:lineRule="auto"/>
+        <w:ind w:firstLine="360"/>
+        <w:jc w:val="both"/>
+      </w:pPr>
+      <w:r>
+        <w:rPr>
+          <w:rFonts w:ascii="Times New Roman" w:hAnsi="Times New Roman" w:eastAsia="Times New Roman"/>
+          <w:b w:val="0"/>
+          <w:caps w:val="0"/>
+          <w:sz w:val="24"/>
+        </w:rPr>
+        <w:t>Mjeti shpërndahet edhe si imazh Docker në GitHub Container Registry, me Python-in, JDK-në dhe git-in brenda, ndaj mund të nisë me një komandë të vetme pa instaluar asgjë tjetër.</w:t>
       </w:r>
     </w:p>
     <w:p>

</xml_diff>

<commit_message>
Përditëso abstraktin, validimin, ndërfaqen dhe prezantimin (#8)
Abstrakti merr pranueshmërinë e rishkrimeve dhe mbetet nën 360 fjalë. Te
4.10 numrat e testeve të 8 tetorit (797 dhe 173), te 4.8 mënyra e thjeshtë
dhe te 4.11 imazhi Docker. Prezantimi merr krahasimin me PMD-në, sllajdin
«A ia vlejnë rishkrimet?» dhe saktëson verifikimin dhe kufizimet (VD-147).
</commit_message>
<xml_diff>
--- a/docs/thesis/Punim_Diplome_Florent_Latifi_Kapitujt_1-4.docx
+++ b/docs/thesis/Punim_Diplome_Florent_Latifi_Kapitujt_1-4.docx
@@ -600,7 +600,7 @@
           <w:caps w:val="0"/>
           <w:sz w:val="24"/>
         </w:rPr>
-        <w:t>Dy rezultate janë negative dhe raportohen si të tilla. Ashpërsia që sistemi e derivon nga teprica mbi pragje nuk e riprodhon gjykimin e rishikuesve: pajtimi i matur me kappa me peshë qëndron te 0.007 deri 0.293, dhe gabimi anon nga mbivlerësimi. Po ashtu, vetë rishikuesit pajtohen mes tyre me MCC 0.022 deri 0.238, çka tregon se një pjesë e pareduktueshme e gabimit të çdo detektori i takon përkufizimit të erës dhe jo detektorit. Motori i refaktorimit automatizon tri transformime dhe transformoi 22.4% të vendeve të detektuara; refuzimi trajtohet si rezultat i saktë dhe numërohet. Kontributi kryesor nuk është një shifër e vetme, por një zinxhir i plotë dhe i riprodhueshëm, nga korpusi deri te rezultati.</w:t>
+        <w:t>Dy rezultate janë negative dhe raportohen si të tilla. Ashpërsia që sistemi e derivon nga teprica mbi pragje nuk e riprodhon gjykimin e rishikuesve: pajtimi i matur me kappa me peshë qëndron te 0.007 deri 0.293, dhe gabimi anon nga mbivlerësimi. Po ashtu, vetë rishikuesit pajtohen mes tyre me MCC 0.022 deri 0.238, çka tregon se një pjesë e pareduktueshme e gabimit të çdo detektori i takon përkufizimit të erës dhe jo detektorit. Motori i refaktorimit automatizon tri transformime dhe transformoi 22.4% të vendeve të detektuara; refuzimi trajtohet si rezultat i saktë dhe numërohet. Leximi i 60 rishkrimeve tregon se 62.9% e tyre, të ripeshuara, janë të pranueshme për një zhvillues: Replace Nested Conditional with Guard Clauses gjithmonë, Introduce Parameter Object asnjëherë, sepse e heq erën nga matja dhe jo nga kodi. Kontributi kryesor nuk është një shifër e vetme, por një zinxhir i plotë dhe i riprodhueshëm, nga korpusi deri te rezultati.</w:t>
       </w:r>
     </w:p>
     <w:p>
@@ -5115,6 +5115,22 @@
     </w:p>
     <w:p>
       <w:pPr>
+        <w:spacing w:line="360" w:lineRule="auto"/>
+        <w:ind w:firstLine="360"/>
+        <w:jc w:val="both"/>
+      </w:pPr>
+      <w:r>
+        <w:rPr>
+          <w:rFonts w:ascii="Times New Roman" w:hAnsi="Times New Roman" w:eastAsia="Times New Roman"/>
+          <w:b w:val="0"/>
+          <w:caps w:val="0"/>
+          <w:sz w:val="24"/>
+        </w:rPr>
+        <w:t>Ndërfaqja ka dy mënyra leximi. Mënyra teknike përdor emrat e literaturës, si Feature Envy ose klauzola «WOC &lt; 0.333». Mënyra e thjeshtë, që hapet si parazgjedhje për një vizitor të ri, i jep çdo ere, metrike, ashpërsie dhe refaktorimi një emër shqip dhe një fjali që e shpjegon, dhe çdo klauzolë e lexon si fjali: «Rreshtat e kodit të metodës: 77 (problem kur është mbi 35)». Shpjegimet janë në një fjalor të vetëm, që e lexojnë njësoj ndërfaqja dhe rreshti i komandës me opsionin --thjeshte, dhe testet kontrollojnë që çdo term që prodhon sistemi të ketë shpjegim.</w:t>
+      </w:r>
+    </w:p>
+    <w:p>
+      <w:pPr>
         <w:pStyle w:val="Heading2"/>
       </w:pPr>
       <w:r>
@@ -5570,7 +5586,7 @@
           <w:caps w:val="0"/>
           <w:sz w:val="24"/>
         </w:rPr>
-        <w:t>Rregulli kryesor është që asnjë prag, metrikë apo detektor nuk ndryshohet vetëm që të kalojë një test; kur kodi dhe testi nuk pajtohen, gjendet më parë cili është i gabuar. Në verifikimin e fundit, më 25 shtator 2026, kaluan 717 teste të backend-it, me mbulim 96% të kodit, dhe 165 teste të ndërfaqes.</w:t>
+        <w:t>Rregulli kryesor është që asnjë prag, metrikë apo detektor nuk ndryshohet vetëm që të kalojë një test; kur kodi dhe testi nuk pajtohen, gjendet më parë cili është i gabuar. Në verifikimin e fundit, më 8 tetor 2026, kaluan 797 teste të backend-it, me mbulim 96% të kodit, dhe 173 teste të ndërfaqes.</w:t>
       </w:r>
     </w:p>
     <w:p>
@@ -5658,6 +5674,22 @@
           <w:sz w:val="24"/>
         </w:rPr>
         <w:t xml:space="preserve"> Eksperimentet u ekzekutuan në një laptop pa kartë grafike të dedikuar, me Windows 11, Python 3.13.1 dhe JDK 21. Çdo skedar rezultati mban commit-in e kodit që e prodhoi, platformën dhe versionin e Python-it, ndaj një shifër lidhet gjithmonë me kodin e saktë që e nxori. Trajnimi i modeleve zgjat disa minuta, ndërsa ekzekutimi i motorit të refaktorimit mbi tërë korpusin disa orë, sepse javac thirret dy herë për çdo skedar të rishkruar. Asnjë hap nuk kërkon shërbim në re apo me pagesë.</w:t>
+      </w:r>
+    </w:p>
+    <w:p>
+      <w:pPr>
+        <w:spacing w:line="360" w:lineRule="auto"/>
+        <w:ind w:firstLine="360"/>
+        <w:jc w:val="both"/>
+      </w:pPr>
+      <w:r>
+        <w:rPr>
+          <w:rFonts w:ascii="Times New Roman" w:hAnsi="Times New Roman" w:eastAsia="Times New Roman"/>
+          <w:b w:val="0"/>
+          <w:caps w:val="0"/>
+          <w:sz w:val="24"/>
+        </w:rPr>
+        <w:t>Mjeti shpërndahet edhe si imazh Docker në GitHub Container Registry, me Python-in, JDK-në dhe git-in brenda, ndaj mund të nisë me një komandë të vetme pa instaluar asgjë tjetër.</w:t>
       </w:r>
     </w:p>
     <w:p>

</xml_diff>